<commit_message>
Fix document title formatting and remove obsolete HTML files from the project.
</commit_message>
<xml_diff>
--- a/Злобин Тимофей 24-3093.docx
+++ b/Злобин Тимофей 24-3093.docx
@@ -14,6 +14,15 @@
       </w:pPr>
       <w:bookmarkStart w:id="0" w:name="_heading=h.gjdgxs"/>
       <w:bookmarkEnd w:id="0"/>
+      <w:r>
+        <w:rPr>
+          <w:rFonts w:eastAsia="Times New Roman" w:cs="Times New Roman"/>
+          <w:b/>
+          <w:szCs w:val="28"/>
+          <w:lang w:val="en-US"/>
+        </w:rPr>
+        <w:t>j</w:t>
+      </w:r>
       <w:r>
         <w:rPr>
           <w:rFonts w:eastAsia="Times New Roman" w:cs="Times New Roman"/>
@@ -6688,16 +6697,7 @@
       </w:r>
       <w:proofErr w:type="gramEnd"/>
       <w:r>
-        <w:t xml:space="preserve"> задания были</w:t>
-      </w:r>
-      <w:r>
-        <w:t xml:space="preserve"> достигну</w:t>
-      </w:r>
-      <w:r>
-        <w:t>ты</w:t>
-      </w:r>
-      <w:r>
-        <w:t xml:space="preserve"> с помощью изучения документа УП04.01 24-3093 (раздел Структура </w:t>
+        <w:t xml:space="preserve"> задания были достигнуты с помощью изучения документа УП04.01 24-3093 (раздел Структура </w:t>
       </w:r>
       <w:r>
         <w:rPr>
@@ -7237,10 +7237,7 @@
       </w:r>
       <w:proofErr w:type="gramEnd"/>
       <w:r>
-        <w:t xml:space="preserve"> задания были достигнуты с помощью изучения документа УП04.01 24-3093 (раздел</w:t>
-      </w:r>
-      <w:r>
-        <w:t xml:space="preserve"> Подключение </w:t>
+        <w:t xml:space="preserve"> задания были достигнуты с помощью изучения документа УП04.01 24-3093 (раздел Подключение </w:t>
       </w:r>
       <w:r>
         <w:rPr>
@@ -7261,10 +7258,7 @@
         <w:t>HTML</w:t>
       </w:r>
       <w:r>
-        <w:t>-документу</w:t>
-      </w:r>
-      <w:r>
-        <w:t xml:space="preserve">), для выполнения последующего задания в конце раздела. </w:t>
+        <w:t xml:space="preserve">-документу), для выполнения последующего задания в конце раздела. </w:t>
       </w:r>
     </w:p>
     <w:p>
@@ -7732,13 +7726,7 @@
       </w:r>
       <w:proofErr w:type="gramEnd"/>
       <w:r>
-        <w:t xml:space="preserve"> задания были достигнуты с помощью изучения документа УП04.01 24-3093 (раздел </w:t>
-      </w:r>
-      <w:r>
-        <w:t>Работа с таблицами и списками</w:t>
-      </w:r>
-      <w:r>
-        <w:t xml:space="preserve">), для выполнения последующего задания в конце раздела. </w:t>
+        <w:t xml:space="preserve"> задания были достигнуты с помощью изучения документа УП04.01 24-3093 (раздел Работа с таблицами и списками), для выполнения последующего задания в конце раздела. </w:t>
       </w:r>
       <w:r>
         <w:t xml:space="preserve"> </w:t>
@@ -8109,27 +8097,14 @@
       <w:r>
         <w:t xml:space="preserve">Рисунок </w:t>
       </w:r>
-      <w:r>
-        <w:fldChar w:fldCharType="begin"/>
-      </w:r>
-      <w:r>
-        <w:instrText xml:space="preserve"> SEQ Рисунок \* ARABIC </w:instrText>
-      </w:r>
-      <w:r>
-        <w:fldChar w:fldCharType="separate"/>
-      </w:r>
-      <w:r>
-        <w:rPr>
-          <w:noProof/>
-        </w:rPr>
-        <w:t>13</w:t>
-      </w:r>
-      <w:r>
-        <w:rPr>
-          <w:noProof/>
-        </w:rPr>
-        <w:fldChar w:fldCharType="end"/>
-      </w:r>
+      <w:fldSimple w:instr=" SEQ Рисунок \* ARABIC ">
+        <w:r>
+          <w:rPr>
+            <w:noProof/>
+          </w:rPr>
+          <w:t>13</w:t>
+        </w:r>
+      </w:fldSimple>
       <w:r>
         <w:t xml:space="preserve"> – </w:t>
       </w:r>

</xml_diff>

<commit_message>
Refactor index.html: Update language to Russian, enhance form structure, and improve accessibility with labels and placeholders. Added two forms: a service request form and a survey form, each with various input types and validation requirements.
</commit_message>
<xml_diff>
--- a/Злобин Тимофей 24-3093.docx
+++ b/Злобин Тимофей 24-3093.docx
@@ -992,7 +992,21 @@
           <w:rFonts w:eastAsia="Times New Roman" w:cs="Times New Roman"/>
           <w:szCs w:val="28"/>
         </w:rPr>
-        <w:t>2025г.</w:t>
+        <w:t>202</w:t>
+      </w:r>
+      <w:r>
+        <w:rPr>
+          <w:rFonts w:eastAsia="Times New Roman" w:cs="Times New Roman"/>
+          <w:szCs w:val="28"/>
+        </w:rPr>
+        <w:t>6</w:t>
+      </w:r>
+      <w:r>
+        <w:rPr>
+          <w:rFonts w:eastAsia="Times New Roman" w:cs="Times New Roman"/>
+          <w:szCs w:val="28"/>
+        </w:rPr>
+        <w:t>г.</w:t>
       </w:r>
       <w:r>
         <w:rPr>
@@ -8185,35 +8199,692 @@
     <w:p>
       <w:pPr>
         <w:pStyle w:val="ae"/>
+      </w:pPr>
+      <w:r>
+        <w:t xml:space="preserve">- </w:t>
+      </w:r>
+      <w:r>
+        <w:t>Разработа</w:t>
+      </w:r>
+      <w:r>
+        <w:t>на</w:t>
+      </w:r>
+      <w:r>
+        <w:t xml:space="preserve"> форм</w:t>
+      </w:r>
+      <w:r>
+        <w:t>а</w:t>
+      </w:r>
+      <w:r>
+        <w:t xml:space="preserve"> </w:t>
+      </w:r>
+      <w:r>
+        <w:t>регистрации</w:t>
+      </w:r>
+    </w:p>
+    <w:p>
+      <w:pPr>
+        <w:pStyle w:val="ae"/>
+        <w:keepNext/>
+        <w:ind w:firstLine="0"/>
+      </w:pPr>
+      <w:r>
+        <w:rPr>
+          <w:noProof/>
+          <w:lang w:val="en-US"/>
+        </w:rPr>
+        <w:drawing>
+          <wp:inline distT="0" distB="0" distL="0" distR="0" wp14:anchorId="245F7C48" wp14:editId="3D0C4F26">
+            <wp:extent cx="5940425" cy="4666615"/>
+            <wp:effectExtent l="0" t="0" r="3175" b="635"/>
+            <wp:docPr id="172579269" name="Рисунок 1"/>
+            <wp:cNvGraphicFramePr>
+              <a:graphicFrameLocks xmlns:a="http://schemas.openxmlformats.org/drawingml/2006/main" noChangeAspect="1"/>
+            </wp:cNvGraphicFramePr>
+            <a:graphic xmlns:a="http://schemas.openxmlformats.org/drawingml/2006/main">
+              <a:graphicData uri="http://schemas.openxmlformats.org/drawingml/2006/picture">
+                <pic:pic xmlns:pic="http://schemas.openxmlformats.org/drawingml/2006/picture">
+                  <pic:nvPicPr>
+                    <pic:cNvPr id="172579269" name=""/>
+                    <pic:cNvPicPr/>
+                  </pic:nvPicPr>
+                  <pic:blipFill>
+                    <a:blip r:embed="rId21"/>
+                    <a:stretch>
+                      <a:fillRect/>
+                    </a:stretch>
+                  </pic:blipFill>
+                  <pic:spPr>
+                    <a:xfrm>
+                      <a:off x="0" y="0"/>
+                      <a:ext cx="5940425" cy="4666615"/>
+                    </a:xfrm>
+                    <a:prstGeom prst="rect">
+                      <a:avLst/>
+                    </a:prstGeom>
+                  </pic:spPr>
+                </pic:pic>
+              </a:graphicData>
+            </a:graphic>
+          </wp:inline>
+        </w:drawing>
+      </w:r>
+    </w:p>
+    <w:p>
+      <w:pPr>
+        <w:pStyle w:val="a5"/>
+        <w:jc w:val="both"/>
+      </w:pPr>
+      <w:r>
+        <w:t xml:space="preserve">Рисунок </w:t>
+      </w:r>
+      <w:fldSimple w:instr=" SEQ Рисунок \* ARABIC ">
+        <w:r>
+          <w:rPr>
+            <w:noProof/>
+          </w:rPr>
+          <w:t>14</w:t>
+        </w:r>
+      </w:fldSimple>
+      <w:r>
+        <w:t xml:space="preserve"> – форма заявки</w:t>
+      </w:r>
+    </w:p>
+    <w:p>
+      <w:pPr>
+        <w:pStyle w:val="ae"/>
+        <w:keepNext/>
+        <w:ind w:firstLine="0"/>
+      </w:pPr>
+      <w:r>
+        <w:rPr>
+          <w:noProof/>
+          <w:lang w:val="en-US"/>
+        </w:rPr>
+        <w:lastRenderedPageBreak/>
+        <w:drawing>
+          <wp:inline distT="0" distB="0" distL="0" distR="0" wp14:anchorId="40FDBF3F" wp14:editId="798E7358">
+            <wp:extent cx="5940425" cy="4944745"/>
+            <wp:effectExtent l="0" t="0" r="3175" b="8255"/>
+            <wp:docPr id="770999419" name="Рисунок 1"/>
+            <wp:cNvGraphicFramePr>
+              <a:graphicFrameLocks xmlns:a="http://schemas.openxmlformats.org/drawingml/2006/main" noChangeAspect="1"/>
+            </wp:cNvGraphicFramePr>
+            <a:graphic xmlns:a="http://schemas.openxmlformats.org/drawingml/2006/main">
+              <a:graphicData uri="http://schemas.openxmlformats.org/drawingml/2006/picture">
+                <pic:pic xmlns:pic="http://schemas.openxmlformats.org/drawingml/2006/picture">
+                  <pic:nvPicPr>
+                    <pic:cNvPr id="770999419" name=""/>
+                    <pic:cNvPicPr/>
+                  </pic:nvPicPr>
+                  <pic:blipFill>
+                    <a:blip r:embed="rId22"/>
+                    <a:stretch>
+                      <a:fillRect/>
+                    </a:stretch>
+                  </pic:blipFill>
+                  <pic:spPr>
+                    <a:xfrm>
+                      <a:off x="0" y="0"/>
+                      <a:ext cx="5940425" cy="4944745"/>
+                    </a:xfrm>
+                    <a:prstGeom prst="rect">
+                      <a:avLst/>
+                    </a:prstGeom>
+                  </pic:spPr>
+                </pic:pic>
+              </a:graphicData>
+            </a:graphic>
+          </wp:inline>
+        </w:drawing>
+      </w:r>
+    </w:p>
+    <w:p>
+      <w:pPr>
+        <w:pStyle w:val="a5"/>
+        <w:jc w:val="both"/>
+        <w:rPr>
+          <w:lang w:val="en-US"/>
+        </w:rPr>
+      </w:pPr>
+      <w:r>
+        <w:t xml:space="preserve">Рисунок </w:t>
+      </w:r>
+      <w:fldSimple w:instr=" SEQ Рисунок \* ARABIC ">
+        <w:r>
+          <w:rPr>
+            <w:noProof/>
+          </w:rPr>
+          <w:t>15</w:t>
+        </w:r>
+      </w:fldSimple>
+      <w:r>
+        <w:t xml:space="preserve"> – форма анкеты</w:t>
+      </w:r>
+    </w:p>
+    <w:p>
+      <w:pPr>
+        <w:pStyle w:val="ae"/>
+        <w:keepNext/>
+        <w:ind w:firstLine="0"/>
+      </w:pPr>
+      <w:r>
+        <w:rPr>
+          <w:noProof/>
+          <w:lang w:val="en-US"/>
+        </w:rPr>
+        <w:drawing>
+          <wp:inline distT="0" distB="0" distL="0" distR="0" wp14:anchorId="31454092" wp14:editId="4B90BFA5">
+            <wp:extent cx="5940425" cy="3007995"/>
+            <wp:effectExtent l="0" t="0" r="3175" b="1905"/>
+            <wp:docPr id="1132979766" name="Рисунок 1"/>
+            <wp:cNvGraphicFramePr>
+              <a:graphicFrameLocks xmlns:a="http://schemas.openxmlformats.org/drawingml/2006/main" noChangeAspect="1"/>
+            </wp:cNvGraphicFramePr>
+            <a:graphic xmlns:a="http://schemas.openxmlformats.org/drawingml/2006/main">
+              <a:graphicData uri="http://schemas.openxmlformats.org/drawingml/2006/picture">
+                <pic:pic xmlns:pic="http://schemas.openxmlformats.org/drawingml/2006/picture">
+                  <pic:nvPicPr>
+                    <pic:cNvPr id="1132979766" name=""/>
+                    <pic:cNvPicPr/>
+                  </pic:nvPicPr>
+                  <pic:blipFill>
+                    <a:blip r:embed="rId23"/>
+                    <a:stretch>
+                      <a:fillRect/>
+                    </a:stretch>
+                  </pic:blipFill>
+                  <pic:spPr>
+                    <a:xfrm>
+                      <a:off x="0" y="0"/>
+                      <a:ext cx="5940425" cy="3007995"/>
+                    </a:xfrm>
+                    <a:prstGeom prst="rect">
+                      <a:avLst/>
+                    </a:prstGeom>
+                  </pic:spPr>
+                </pic:pic>
+              </a:graphicData>
+            </a:graphic>
+          </wp:inline>
+        </w:drawing>
+      </w:r>
+    </w:p>
+    <w:p>
+      <w:pPr>
+        <w:pStyle w:val="a5"/>
+        <w:jc w:val="both"/>
+      </w:pPr>
+      <w:r>
+        <w:t xml:space="preserve">Рисунок </w:t>
+      </w:r>
+      <w:fldSimple w:instr=" SEQ Рисунок \* ARABIC ">
+        <w:r>
+          <w:rPr>
+            <w:noProof/>
+          </w:rPr>
+          <w:t>16</w:t>
+        </w:r>
+      </w:fldSimple>
+      <w:r>
+        <w:t xml:space="preserve"> – форма регистрации</w:t>
+      </w:r>
+    </w:p>
+    <w:p/>
+    <w:p>
+      <w:pPr>
+        <w:spacing w:after="160" w:line="259" w:lineRule="auto"/>
+        <w:jc w:val="left"/>
+      </w:pPr>
+      <w:r>
+        <w:br w:type="page"/>
+      </w:r>
+    </w:p>
+    <w:p>
+      <w:pPr>
+        <w:pStyle w:val="ad"/>
+      </w:pPr>
+      <w:r>
+        <w:lastRenderedPageBreak/>
+        <w:t>Фреймы</w:t>
+      </w:r>
+    </w:p>
+    <w:p>
+      <w:pPr>
+        <w:spacing w:after="5" w:line="387" w:lineRule="auto"/>
+        <w:ind w:right="67"/>
+      </w:pPr>
+      <w:r>
+        <w:t xml:space="preserve">- </w:t>
+      </w:r>
+      <w:r>
+        <w:t>Созда</w:t>
+      </w:r>
+      <w:r>
+        <w:t>н</w:t>
+      </w:r>
+      <w:r>
+        <w:t xml:space="preserve"> документ раскладки, где б</w:t>
+      </w:r>
+      <w:r>
+        <w:t>ыло</w:t>
+      </w:r>
+      <w:r>
+        <w:t xml:space="preserve"> распределено 3 фрейма: заголовочный фрейм, фрейм меню, фрейм для отображения информации, </w:t>
+      </w:r>
+    </w:p>
+    <w:p>
+      <w:pPr>
+        <w:spacing w:after="5" w:line="387" w:lineRule="auto"/>
+        <w:ind w:right="67"/>
+      </w:pPr>
+      <w:r>
+        <w:t xml:space="preserve">- </w:t>
+      </w:r>
+      <w:r>
+        <w:t>Созда</w:t>
+      </w:r>
+      <w:r>
+        <w:t>но</w:t>
+      </w:r>
+      <w:r>
+        <w:t xml:space="preserve"> 2 дополнительных фрейма для отображения информации,</w:t>
+      </w:r>
+    </w:p>
+    <w:p>
+      <w:pPr>
+        <w:spacing w:after="5" w:line="387" w:lineRule="auto"/>
+        <w:ind w:right="67"/>
+      </w:pPr>
+      <w:r>
+        <w:t xml:space="preserve">- </w:t>
+      </w:r>
+      <w:r>
+        <w:t>Обеспеч</w:t>
+      </w:r>
+      <w:r>
+        <w:t>ена</w:t>
+      </w:r>
+      <w:r>
+        <w:t xml:space="preserve"> смен</w:t>
+      </w:r>
+      <w:r>
+        <w:t>а</w:t>
+      </w:r>
+      <w:r>
+        <w:t xml:space="preserve"> страниц в информационном фрейме с помощью меню и с помощью «кнопок» на самом информационном фрейме.</w:t>
+      </w:r>
+    </w:p>
+    <w:p/>
+    <w:p>
+      <w:r>
+        <w:drawing>
+          <wp:inline distT="0" distB="0" distL="0" distR="0" wp14:anchorId="02957238" wp14:editId="720EB8E6">
+            <wp:extent cx="5940425" cy="1247775"/>
+            <wp:effectExtent l="0" t="0" r="3175" b="9525"/>
+            <wp:docPr id="1330729470" name="Рисунок 1"/>
+            <wp:cNvGraphicFramePr>
+              <a:graphicFrameLocks xmlns:a="http://schemas.openxmlformats.org/drawingml/2006/main" noChangeAspect="1"/>
+            </wp:cNvGraphicFramePr>
+            <a:graphic xmlns:a="http://schemas.openxmlformats.org/drawingml/2006/main">
+              <a:graphicData uri="http://schemas.openxmlformats.org/drawingml/2006/picture">
+                <pic:pic xmlns:pic="http://schemas.openxmlformats.org/drawingml/2006/picture">
+                  <pic:nvPicPr>
+                    <pic:cNvPr id="1330729470" name=""/>
+                    <pic:cNvPicPr/>
+                  </pic:nvPicPr>
+                  <pic:blipFill>
+                    <a:blip r:embed="rId24"/>
+                    <a:stretch>
+                      <a:fillRect/>
+                    </a:stretch>
+                  </pic:blipFill>
+                  <pic:spPr>
+                    <a:xfrm>
+                      <a:off x="0" y="0"/>
+                      <a:ext cx="5940425" cy="1247775"/>
+                    </a:xfrm>
+                    <a:prstGeom prst="rect">
+                      <a:avLst/>
+                    </a:prstGeom>
+                  </pic:spPr>
+                </pic:pic>
+              </a:graphicData>
+            </a:graphic>
+          </wp:inline>
+        </w:drawing>
+      </w:r>
+    </w:p>
+    <w:p>
+      <w:r>
+        <w:drawing>
+          <wp:inline distT="0" distB="0" distL="0" distR="0" wp14:anchorId="1CCAC54F" wp14:editId="2057F2AE">
+            <wp:extent cx="5940425" cy="1636395"/>
+            <wp:effectExtent l="0" t="0" r="3175" b="1905"/>
+            <wp:docPr id="1328656903" name="Рисунок 1"/>
+            <wp:cNvGraphicFramePr>
+              <a:graphicFrameLocks xmlns:a="http://schemas.openxmlformats.org/drawingml/2006/main" noChangeAspect="1"/>
+            </wp:cNvGraphicFramePr>
+            <a:graphic xmlns:a="http://schemas.openxmlformats.org/drawingml/2006/main">
+              <a:graphicData uri="http://schemas.openxmlformats.org/drawingml/2006/picture">
+                <pic:pic xmlns:pic="http://schemas.openxmlformats.org/drawingml/2006/picture">
+                  <pic:nvPicPr>
+                    <pic:cNvPr id="1328656903" name=""/>
+                    <pic:cNvPicPr/>
+                  </pic:nvPicPr>
+                  <pic:blipFill>
+                    <a:blip r:embed="rId25"/>
+                    <a:stretch>
+                      <a:fillRect/>
+                    </a:stretch>
+                  </pic:blipFill>
+                  <pic:spPr>
+                    <a:xfrm>
+                      <a:off x="0" y="0"/>
+                      <a:ext cx="5940425" cy="1636395"/>
+                    </a:xfrm>
+                    <a:prstGeom prst="rect">
+                      <a:avLst/>
+                    </a:prstGeom>
+                  </pic:spPr>
+                </pic:pic>
+              </a:graphicData>
+            </a:graphic>
+          </wp:inline>
+        </w:drawing>
+      </w:r>
+    </w:p>
+    <w:p>
+      <w:r>
+        <w:lastRenderedPageBreak/>
+        <w:drawing>
+          <wp:inline distT="0" distB="0" distL="0" distR="0" wp14:anchorId="13462FC7" wp14:editId="4D7F3792">
+            <wp:extent cx="5940425" cy="3605530"/>
+            <wp:effectExtent l="0" t="0" r="3175" b="0"/>
+            <wp:docPr id="1259691433" name="Рисунок 1"/>
+            <wp:cNvGraphicFramePr>
+              <a:graphicFrameLocks xmlns:a="http://schemas.openxmlformats.org/drawingml/2006/main" noChangeAspect="1"/>
+            </wp:cNvGraphicFramePr>
+            <a:graphic xmlns:a="http://schemas.openxmlformats.org/drawingml/2006/main">
+              <a:graphicData uri="http://schemas.openxmlformats.org/drawingml/2006/picture">
+                <pic:pic xmlns:pic="http://schemas.openxmlformats.org/drawingml/2006/picture">
+                  <pic:nvPicPr>
+                    <pic:cNvPr id="1259691433" name=""/>
+                    <pic:cNvPicPr/>
+                  </pic:nvPicPr>
+                  <pic:blipFill>
+                    <a:blip r:embed="rId26"/>
+                    <a:stretch>
+                      <a:fillRect/>
+                    </a:stretch>
+                  </pic:blipFill>
+                  <pic:spPr>
+                    <a:xfrm>
+                      <a:off x="0" y="0"/>
+                      <a:ext cx="5940425" cy="3605530"/>
+                    </a:xfrm>
+                    <a:prstGeom prst="rect">
+                      <a:avLst/>
+                    </a:prstGeom>
+                  </pic:spPr>
+                </pic:pic>
+              </a:graphicData>
+            </a:graphic>
+          </wp:inline>
+        </w:drawing>
+      </w:r>
+    </w:p>
+    <w:p>
+      <w:r>
+        <w:drawing>
+          <wp:inline distT="0" distB="0" distL="0" distR="0" wp14:anchorId="6F1C24C2" wp14:editId="25BB0663">
+            <wp:extent cx="4963218" cy="3581900"/>
+            <wp:effectExtent l="0" t="0" r="8890" b="0"/>
+            <wp:docPr id="93305329" name="Рисунок 1"/>
+            <wp:cNvGraphicFramePr>
+              <a:graphicFrameLocks xmlns:a="http://schemas.openxmlformats.org/drawingml/2006/main" noChangeAspect="1"/>
+            </wp:cNvGraphicFramePr>
+            <a:graphic xmlns:a="http://schemas.openxmlformats.org/drawingml/2006/main">
+              <a:graphicData uri="http://schemas.openxmlformats.org/drawingml/2006/picture">
+                <pic:pic xmlns:pic="http://schemas.openxmlformats.org/drawingml/2006/picture">
+                  <pic:nvPicPr>
+                    <pic:cNvPr id="93305329" name=""/>
+                    <pic:cNvPicPr/>
+                  </pic:nvPicPr>
+                  <pic:blipFill>
+                    <a:blip r:embed="rId27"/>
+                    <a:stretch>
+                      <a:fillRect/>
+                    </a:stretch>
+                  </pic:blipFill>
+                  <pic:spPr>
+                    <a:xfrm>
+                      <a:off x="0" y="0"/>
+                      <a:ext cx="4963218" cy="3581900"/>
+                    </a:xfrm>
+                    <a:prstGeom prst="rect">
+                      <a:avLst/>
+                    </a:prstGeom>
+                  </pic:spPr>
+                </pic:pic>
+              </a:graphicData>
+            </a:graphic>
+          </wp:inline>
+        </w:drawing>
+      </w:r>
+    </w:p>
+    <w:p>
+      <w:r>
+        <w:lastRenderedPageBreak/>
+        <w:drawing>
+          <wp:inline distT="0" distB="0" distL="0" distR="0" wp14:anchorId="052FD247" wp14:editId="4E50E7F5">
+            <wp:extent cx="5940425" cy="7647305"/>
+            <wp:effectExtent l="0" t="0" r="3175" b="0"/>
+            <wp:docPr id="1915954438" name="Рисунок 1"/>
+            <wp:cNvGraphicFramePr>
+              <a:graphicFrameLocks xmlns:a="http://schemas.openxmlformats.org/drawingml/2006/main" noChangeAspect="1"/>
+            </wp:cNvGraphicFramePr>
+            <a:graphic xmlns:a="http://schemas.openxmlformats.org/drawingml/2006/main">
+              <a:graphicData uri="http://schemas.openxmlformats.org/drawingml/2006/picture">
+                <pic:pic xmlns:pic="http://schemas.openxmlformats.org/drawingml/2006/picture">
+                  <pic:nvPicPr>
+                    <pic:cNvPr id="1915954438" name=""/>
+                    <pic:cNvPicPr/>
+                  </pic:nvPicPr>
+                  <pic:blipFill>
+                    <a:blip r:embed="rId28"/>
+                    <a:stretch>
+                      <a:fillRect/>
+                    </a:stretch>
+                  </pic:blipFill>
+                  <pic:spPr>
+                    <a:xfrm>
+                      <a:off x="0" y="0"/>
+                      <a:ext cx="5940425" cy="7647305"/>
+                    </a:xfrm>
+                    <a:prstGeom prst="rect">
+                      <a:avLst/>
+                    </a:prstGeom>
+                  </pic:spPr>
+                </pic:pic>
+              </a:graphicData>
+            </a:graphic>
+          </wp:inline>
+        </w:drawing>
+      </w:r>
+    </w:p>
+    <w:p>
+      <w:r>
+        <w:lastRenderedPageBreak/>
+        <w:drawing>
+          <wp:inline distT="0" distB="0" distL="0" distR="0" wp14:anchorId="5FBE314C" wp14:editId="119054AB">
+            <wp:extent cx="5940425" cy="2639695"/>
+            <wp:effectExtent l="0" t="0" r="3175" b="8255"/>
+            <wp:docPr id="2046642278" name="Рисунок 1"/>
+            <wp:cNvGraphicFramePr>
+              <a:graphicFrameLocks xmlns:a="http://schemas.openxmlformats.org/drawingml/2006/main" noChangeAspect="1"/>
+            </wp:cNvGraphicFramePr>
+            <a:graphic xmlns:a="http://schemas.openxmlformats.org/drawingml/2006/main">
+              <a:graphicData uri="http://schemas.openxmlformats.org/drawingml/2006/picture">
+                <pic:pic xmlns:pic="http://schemas.openxmlformats.org/drawingml/2006/picture">
+                  <pic:nvPicPr>
+                    <pic:cNvPr id="2046642278" name=""/>
+                    <pic:cNvPicPr/>
+                  </pic:nvPicPr>
+                  <pic:blipFill>
+                    <a:blip r:embed="rId29"/>
+                    <a:stretch>
+                      <a:fillRect/>
+                    </a:stretch>
+                  </pic:blipFill>
+                  <pic:spPr>
+                    <a:xfrm>
+                      <a:off x="0" y="0"/>
+                      <a:ext cx="5940425" cy="2639695"/>
+                    </a:xfrm>
+                    <a:prstGeom prst="rect">
+                      <a:avLst/>
+                    </a:prstGeom>
+                  </pic:spPr>
+                </pic:pic>
+              </a:graphicData>
+            </a:graphic>
+          </wp:inline>
+        </w:drawing>
+      </w:r>
+    </w:p>
+    <w:p>
+      <w:r>
+        <w:lastRenderedPageBreak/>
+        <w:drawing>
+          <wp:inline distT="0" distB="0" distL="0" distR="0" wp14:anchorId="31359F3D" wp14:editId="14B8DF5B">
+            <wp:extent cx="5940425" cy="8145780"/>
+            <wp:effectExtent l="0" t="0" r="3175" b="7620"/>
+            <wp:docPr id="162420627" name="Рисунок 1"/>
+            <wp:cNvGraphicFramePr>
+              <a:graphicFrameLocks xmlns:a="http://schemas.openxmlformats.org/drawingml/2006/main" noChangeAspect="1"/>
+            </wp:cNvGraphicFramePr>
+            <a:graphic xmlns:a="http://schemas.openxmlformats.org/drawingml/2006/main">
+              <a:graphicData uri="http://schemas.openxmlformats.org/drawingml/2006/picture">
+                <pic:pic xmlns:pic="http://schemas.openxmlformats.org/drawingml/2006/picture">
+                  <pic:nvPicPr>
+                    <pic:cNvPr id="162420627" name=""/>
+                    <pic:cNvPicPr/>
+                  </pic:nvPicPr>
+                  <pic:blipFill>
+                    <a:blip r:embed="rId30"/>
+                    <a:stretch>
+                      <a:fillRect/>
+                    </a:stretch>
+                  </pic:blipFill>
+                  <pic:spPr>
+                    <a:xfrm>
+                      <a:off x="0" y="0"/>
+                      <a:ext cx="5940425" cy="8145780"/>
+                    </a:xfrm>
+                    <a:prstGeom prst="rect">
+                      <a:avLst/>
+                    </a:prstGeom>
+                  </pic:spPr>
+                </pic:pic>
+              </a:graphicData>
+            </a:graphic>
+          </wp:inline>
+        </w:drawing>
+      </w:r>
+    </w:p>
+    <w:p>
+      <w:r>
+        <w:lastRenderedPageBreak/>
+        <w:drawing>
+          <wp:inline distT="0" distB="0" distL="0" distR="0" wp14:anchorId="1F67B7B7" wp14:editId="03FB331D">
+            <wp:extent cx="5940425" cy="3012440"/>
+            <wp:effectExtent l="0" t="0" r="3175" b="0"/>
+            <wp:docPr id="703003647" name="Рисунок 1"/>
+            <wp:cNvGraphicFramePr>
+              <a:graphicFrameLocks xmlns:a="http://schemas.openxmlformats.org/drawingml/2006/main" noChangeAspect="1"/>
+            </wp:cNvGraphicFramePr>
+            <a:graphic xmlns:a="http://schemas.openxmlformats.org/drawingml/2006/main">
+              <a:graphicData uri="http://schemas.openxmlformats.org/drawingml/2006/picture">
+                <pic:pic xmlns:pic="http://schemas.openxmlformats.org/drawingml/2006/picture">
+                  <pic:nvPicPr>
+                    <pic:cNvPr id="703003647" name=""/>
+                    <pic:cNvPicPr/>
+                  </pic:nvPicPr>
+                  <pic:blipFill>
+                    <a:blip r:embed="rId31"/>
+                    <a:stretch>
+                      <a:fillRect/>
+                    </a:stretch>
+                  </pic:blipFill>
+                  <pic:spPr>
+                    <a:xfrm>
+                      <a:off x="0" y="0"/>
+                      <a:ext cx="5940425" cy="3012440"/>
+                    </a:xfrm>
+                    <a:prstGeom prst="rect">
+                      <a:avLst/>
+                    </a:prstGeom>
+                  </pic:spPr>
+                </pic:pic>
+              </a:graphicData>
+            </a:graphic>
+          </wp:inline>
+        </w:drawing>
+      </w:r>
+    </w:p>
+    <w:p>
+      <w:r>
+        <w:drawing>
+          <wp:inline distT="0" distB="0" distL="0" distR="0" wp14:anchorId="2B30018F" wp14:editId="6BB8853E">
+            <wp:extent cx="5915851" cy="3562847"/>
+            <wp:effectExtent l="0" t="0" r="8890" b="0"/>
+            <wp:docPr id="1390217989" name="Рисунок 1"/>
+            <wp:cNvGraphicFramePr>
+              <a:graphicFrameLocks xmlns:a="http://schemas.openxmlformats.org/drawingml/2006/main" noChangeAspect="1"/>
+            </wp:cNvGraphicFramePr>
+            <a:graphic xmlns:a="http://schemas.openxmlformats.org/drawingml/2006/main">
+              <a:graphicData uri="http://schemas.openxmlformats.org/drawingml/2006/picture">
+                <pic:pic xmlns:pic="http://schemas.openxmlformats.org/drawingml/2006/picture">
+                  <pic:nvPicPr>
+                    <pic:cNvPr id="1390217989" name=""/>
+                    <pic:cNvPicPr/>
+                  </pic:nvPicPr>
+                  <pic:blipFill>
+                    <a:blip r:embed="rId32"/>
+                    <a:stretch>
+                      <a:fillRect/>
+                    </a:stretch>
+                  </pic:blipFill>
+                  <pic:spPr>
+                    <a:xfrm>
+                      <a:off x="0" y="0"/>
+                      <a:ext cx="5915851" cy="3562847"/>
+                    </a:xfrm>
+                    <a:prstGeom prst="rect">
+                      <a:avLst/>
+                    </a:prstGeom>
+                  </pic:spPr>
+                </pic:pic>
+              </a:graphicData>
+            </a:graphic>
+          </wp:inline>
+        </w:drawing>
+      </w:r>
+    </w:p>
+    <w:p>
+      <w:pPr>
+        <w:rPr>
+          <w:lang w:val="en-US"/>
+        </w:rPr>
         <w:sectPr>
-          <w:footerReference w:type="default" r:id="rId21"/>
+          <w:footerReference w:type="default" r:id="rId33"/>
           <w:pgSz w:w="11906" w:h="16838"/>
           <w:pgMar w:top="1134" w:right="850" w:bottom="1134" w:left="1701" w:header="708" w:footer="708" w:gutter="0"/>
           <w:pgNumType w:start="1"/>
           <w:cols w:space="720"/>
         </w:sectPr>
       </w:pPr>
-      <w:r>
-        <w:t xml:space="preserve">- </w:t>
-      </w:r>
-      <w:r>
-        <w:t>Разработа</w:t>
-      </w:r>
-      <w:r>
-        <w:t>на</w:t>
-      </w:r>
-      <w:r>
-        <w:t xml:space="preserve"> форм</w:t>
-      </w:r>
-      <w:r>
-        <w:t>а</w:t>
-      </w:r>
-      <w:r>
-        <w:t xml:space="preserve"> </w:t>
-      </w:r>
-      <w:r>
-        <w:t>регистрации</w:t>
-      </w:r>
     </w:p>
     <w:p>
       <w:pPr>
@@ -9388,7 +10059,7 @@
       <w:bookmarkEnd w:id="9"/>
     </w:p>
     <w:sectPr>
-      <w:footerReference w:type="default" r:id="rId22"/>
+      <w:footerReference w:type="default" r:id="rId34"/>
       <w:pgSz w:w="11906" w:h="16838"/>
       <w:pgMar w:top="1134" w:right="850" w:bottom="1134" w:left="1701" w:header="708" w:footer="708" w:gutter="0"/>
       <w:cols w:space="708"/>
@@ -9703,6 +10374,218 @@
     </w:lvl>
   </w:abstractNum>
   <w:abstractNum w:abstractNumId="2" w15:restartNumberingAfterBreak="0">
+    <w:nsid w:val="1E13726C"/>
+    <w:multiLevelType w:val="hybridMultilevel"/>
+    <w:tmpl w:val="C9FA3B02"/>
+    <w:lvl w:ilvl="0" w:tplc="13F85E98">
+      <w:start w:val="1"/>
+      <w:numFmt w:val="decimal"/>
+      <w:lvlText w:val="%1."/>
+      <w:lvlJc w:val="left"/>
+      <w:pPr>
+        <w:ind w:left="354"/>
+      </w:pPr>
+      <w:rPr>
+        <w:rFonts w:ascii="Times New Roman" w:eastAsia="Times New Roman" w:hAnsi="Times New Roman" w:cs="Times New Roman"/>
+        <w:b w:val="0"/>
+        <w:i w:val="0"/>
+        <w:strike w:val="0"/>
+        <w:dstrike w:val="0"/>
+        <w:color w:val="000000"/>
+        <w:sz w:val="28"/>
+        <w:szCs w:val="28"/>
+        <w:u w:val="none" w:color="000000"/>
+        <w:bdr w:val="none" w:sz="0" w:space="0" w:color="auto"/>
+        <w:shd w:val="clear" w:color="auto" w:fill="auto"/>
+        <w:vertAlign w:val="baseline"/>
+      </w:rPr>
+    </w:lvl>
+    <w:lvl w:ilvl="1" w:tplc="52445362">
+      <w:start w:val="1"/>
+      <w:numFmt w:val="lowerLetter"/>
+      <w:lvlText w:val="%2"/>
+      <w:lvlJc w:val="left"/>
+      <w:pPr>
+        <w:ind w:left="2408"/>
+      </w:pPr>
+      <w:rPr>
+        <w:rFonts w:ascii="Times New Roman" w:eastAsia="Times New Roman" w:hAnsi="Times New Roman" w:cs="Times New Roman"/>
+        <w:b w:val="0"/>
+        <w:i w:val="0"/>
+        <w:strike w:val="0"/>
+        <w:dstrike w:val="0"/>
+        <w:color w:val="000000"/>
+        <w:sz w:val="28"/>
+        <w:szCs w:val="28"/>
+        <w:u w:val="none" w:color="000000"/>
+        <w:bdr w:val="none" w:sz="0" w:space="0" w:color="auto"/>
+        <w:shd w:val="clear" w:color="auto" w:fill="auto"/>
+        <w:vertAlign w:val="baseline"/>
+      </w:rPr>
+    </w:lvl>
+    <w:lvl w:ilvl="2" w:tplc="69126FD0">
+      <w:start w:val="1"/>
+      <w:numFmt w:val="lowerRoman"/>
+      <w:lvlText w:val="%3"/>
+      <w:lvlJc w:val="left"/>
+      <w:pPr>
+        <w:ind w:left="3128"/>
+      </w:pPr>
+      <w:rPr>
+        <w:rFonts w:ascii="Times New Roman" w:eastAsia="Times New Roman" w:hAnsi="Times New Roman" w:cs="Times New Roman"/>
+        <w:b w:val="0"/>
+        <w:i w:val="0"/>
+        <w:strike w:val="0"/>
+        <w:dstrike w:val="0"/>
+        <w:color w:val="000000"/>
+        <w:sz w:val="28"/>
+        <w:szCs w:val="28"/>
+        <w:u w:val="none" w:color="000000"/>
+        <w:bdr w:val="none" w:sz="0" w:space="0" w:color="auto"/>
+        <w:shd w:val="clear" w:color="auto" w:fill="auto"/>
+        <w:vertAlign w:val="baseline"/>
+      </w:rPr>
+    </w:lvl>
+    <w:lvl w:ilvl="3" w:tplc="E1AC2C22">
+      <w:start w:val="1"/>
+      <w:numFmt w:val="decimal"/>
+      <w:lvlText w:val="%4"/>
+      <w:lvlJc w:val="left"/>
+      <w:pPr>
+        <w:ind w:left="3848"/>
+      </w:pPr>
+      <w:rPr>
+        <w:rFonts w:ascii="Times New Roman" w:eastAsia="Times New Roman" w:hAnsi="Times New Roman" w:cs="Times New Roman"/>
+        <w:b w:val="0"/>
+        <w:i w:val="0"/>
+        <w:strike w:val="0"/>
+        <w:dstrike w:val="0"/>
+        <w:color w:val="000000"/>
+        <w:sz w:val="28"/>
+        <w:szCs w:val="28"/>
+        <w:u w:val="none" w:color="000000"/>
+        <w:bdr w:val="none" w:sz="0" w:space="0" w:color="auto"/>
+        <w:shd w:val="clear" w:color="auto" w:fill="auto"/>
+        <w:vertAlign w:val="baseline"/>
+      </w:rPr>
+    </w:lvl>
+    <w:lvl w:ilvl="4" w:tplc="937C7940">
+      <w:start w:val="1"/>
+      <w:numFmt w:val="lowerLetter"/>
+      <w:lvlText w:val="%5"/>
+      <w:lvlJc w:val="left"/>
+      <w:pPr>
+        <w:ind w:left="4568"/>
+      </w:pPr>
+      <w:rPr>
+        <w:rFonts w:ascii="Times New Roman" w:eastAsia="Times New Roman" w:hAnsi="Times New Roman" w:cs="Times New Roman"/>
+        <w:b w:val="0"/>
+        <w:i w:val="0"/>
+        <w:strike w:val="0"/>
+        <w:dstrike w:val="0"/>
+        <w:color w:val="000000"/>
+        <w:sz w:val="28"/>
+        <w:szCs w:val="28"/>
+        <w:u w:val="none" w:color="000000"/>
+        <w:bdr w:val="none" w:sz="0" w:space="0" w:color="auto"/>
+        <w:shd w:val="clear" w:color="auto" w:fill="auto"/>
+        <w:vertAlign w:val="baseline"/>
+      </w:rPr>
+    </w:lvl>
+    <w:lvl w:ilvl="5" w:tplc="2E747656">
+      <w:start w:val="1"/>
+      <w:numFmt w:val="lowerRoman"/>
+      <w:lvlText w:val="%6"/>
+      <w:lvlJc w:val="left"/>
+      <w:pPr>
+        <w:ind w:left="5288"/>
+      </w:pPr>
+      <w:rPr>
+        <w:rFonts w:ascii="Times New Roman" w:eastAsia="Times New Roman" w:hAnsi="Times New Roman" w:cs="Times New Roman"/>
+        <w:b w:val="0"/>
+        <w:i w:val="0"/>
+        <w:strike w:val="0"/>
+        <w:dstrike w:val="0"/>
+        <w:color w:val="000000"/>
+        <w:sz w:val="28"/>
+        <w:szCs w:val="28"/>
+        <w:u w:val="none" w:color="000000"/>
+        <w:bdr w:val="none" w:sz="0" w:space="0" w:color="auto"/>
+        <w:shd w:val="clear" w:color="auto" w:fill="auto"/>
+        <w:vertAlign w:val="baseline"/>
+      </w:rPr>
+    </w:lvl>
+    <w:lvl w:ilvl="6" w:tplc="399A33EE">
+      <w:start w:val="1"/>
+      <w:numFmt w:val="decimal"/>
+      <w:lvlText w:val="%7"/>
+      <w:lvlJc w:val="left"/>
+      <w:pPr>
+        <w:ind w:left="6008"/>
+      </w:pPr>
+      <w:rPr>
+        <w:rFonts w:ascii="Times New Roman" w:eastAsia="Times New Roman" w:hAnsi="Times New Roman" w:cs="Times New Roman"/>
+        <w:b w:val="0"/>
+        <w:i w:val="0"/>
+        <w:strike w:val="0"/>
+        <w:dstrike w:val="0"/>
+        <w:color w:val="000000"/>
+        <w:sz w:val="28"/>
+        <w:szCs w:val="28"/>
+        <w:u w:val="none" w:color="000000"/>
+        <w:bdr w:val="none" w:sz="0" w:space="0" w:color="auto"/>
+        <w:shd w:val="clear" w:color="auto" w:fill="auto"/>
+        <w:vertAlign w:val="baseline"/>
+      </w:rPr>
+    </w:lvl>
+    <w:lvl w:ilvl="7" w:tplc="A1A006F0">
+      <w:start w:val="1"/>
+      <w:numFmt w:val="lowerLetter"/>
+      <w:lvlText w:val="%8"/>
+      <w:lvlJc w:val="left"/>
+      <w:pPr>
+        <w:ind w:left="6728"/>
+      </w:pPr>
+      <w:rPr>
+        <w:rFonts w:ascii="Times New Roman" w:eastAsia="Times New Roman" w:hAnsi="Times New Roman" w:cs="Times New Roman"/>
+        <w:b w:val="0"/>
+        <w:i w:val="0"/>
+        <w:strike w:val="0"/>
+        <w:dstrike w:val="0"/>
+        <w:color w:val="000000"/>
+        <w:sz w:val="28"/>
+        <w:szCs w:val="28"/>
+        <w:u w:val="none" w:color="000000"/>
+        <w:bdr w:val="none" w:sz="0" w:space="0" w:color="auto"/>
+        <w:shd w:val="clear" w:color="auto" w:fill="auto"/>
+        <w:vertAlign w:val="baseline"/>
+      </w:rPr>
+    </w:lvl>
+    <w:lvl w:ilvl="8" w:tplc="6E481944">
+      <w:start w:val="1"/>
+      <w:numFmt w:val="lowerRoman"/>
+      <w:lvlText w:val="%9"/>
+      <w:lvlJc w:val="left"/>
+      <w:pPr>
+        <w:ind w:left="7448"/>
+      </w:pPr>
+      <w:rPr>
+        <w:rFonts w:ascii="Times New Roman" w:eastAsia="Times New Roman" w:hAnsi="Times New Roman" w:cs="Times New Roman"/>
+        <w:b w:val="0"/>
+        <w:i w:val="0"/>
+        <w:strike w:val="0"/>
+        <w:dstrike w:val="0"/>
+        <w:color w:val="000000"/>
+        <w:sz w:val="28"/>
+        <w:szCs w:val="28"/>
+        <w:u w:val="none" w:color="000000"/>
+        <w:bdr w:val="none" w:sz="0" w:space="0" w:color="auto"/>
+        <w:shd w:val="clear" w:color="auto" w:fill="auto"/>
+        <w:vertAlign w:val="baseline"/>
+      </w:rPr>
+    </w:lvl>
+  </w:abstractNum>
+  <w:abstractNum w:abstractNumId="3" w15:restartNumberingAfterBreak="0">
     <w:nsid w:val="336C76F7"/>
     <w:multiLevelType w:val="hybridMultilevel"/>
     <w:tmpl w:val="790ADE14"/>
@@ -9815,7 +10698,7 @@
       </w:rPr>
     </w:lvl>
   </w:abstractNum>
-  <w:abstractNum w:abstractNumId="3" w15:restartNumberingAfterBreak="0">
+  <w:abstractNum w:abstractNumId="4" w15:restartNumberingAfterBreak="0">
     <w:nsid w:val="5C684001"/>
     <w:multiLevelType w:val="hybridMultilevel"/>
     <w:tmpl w:val="2B0CB034"/>
@@ -9904,7 +10787,7 @@
       </w:pPr>
     </w:lvl>
   </w:abstractNum>
-  <w:abstractNum w:abstractNumId="4" w15:restartNumberingAfterBreak="0">
+  <w:abstractNum w:abstractNumId="5" w15:restartNumberingAfterBreak="0">
     <w:nsid w:val="69801D13"/>
     <w:multiLevelType w:val="hybridMultilevel"/>
     <w:tmpl w:val="D2EC35F6"/>
@@ -9993,7 +10876,7 @@
       </w:pPr>
     </w:lvl>
   </w:abstractNum>
-  <w:abstractNum w:abstractNumId="5" w15:restartNumberingAfterBreak="0">
+  <w:abstractNum w:abstractNumId="6" w15:restartNumberingAfterBreak="0">
     <w:nsid w:val="6AE17AD8"/>
     <w:multiLevelType w:val="hybridMultilevel"/>
     <w:tmpl w:val="F94EA8A0"/>
@@ -10113,19 +10996,22 @@
     <w:abstractNumId w:val="0"/>
   </w:num>
   <w:num w:numId="3" w16cid:durableId="125241931">
+    <w:abstractNumId w:val="6"/>
+  </w:num>
+  <w:num w:numId="4" w16cid:durableId="1800223730">
+    <w:abstractNumId w:val="4"/>
+  </w:num>
+  <w:num w:numId="5" w16cid:durableId="875894278">
     <w:abstractNumId w:val="5"/>
   </w:num>
-  <w:num w:numId="4" w16cid:durableId="1800223730">
+  <w:num w:numId="6" w16cid:durableId="446848764">
     <w:abstractNumId w:val="3"/>
-  </w:num>
-  <w:num w:numId="5" w16cid:durableId="875894278">
-    <w:abstractNumId w:val="4"/>
-  </w:num>
-  <w:num w:numId="6" w16cid:durableId="446848764">
-    <w:abstractNumId w:val="2"/>
   </w:num>
   <w:num w:numId="7" w16cid:durableId="231308199">
     <w:abstractNumId w:val="1"/>
+  </w:num>
+  <w:num w:numId="8" w16cid:durableId="545144632">
+    <w:abstractNumId w:val="2"/>
   </w:num>
 </w:numbering>
 </file>

</xml_diff>